<commit_message>
💍 Purificação POUPE 3.1: Biblioteca 100% Pro, tabelas reais no Word e fontes MD completas
</commit_message>
<xml_diff>
--- a/templates/01_geral/07_ata_reuniao.docx
+++ b/templates/01_geral/07_ata_reuniao.docx
@@ -313,70 +313,359 @@
         <w:t xml:space="preserve">4. ENCAMINHAMENTOS E RESPONSÁVEIS</w:t>
       </w:r>
     </w:p>
-    <w:p>
-      <w:pPr>
-        <w:spacing w:after="100" w:before="100"/>
-      </w:pPr>
-      <w:r>
-        <w:rPr>
-          <w:rFonts w:ascii="Arial" w:cs="Arial" w:eastAsia="Arial" w:hAnsi="Arial"/>
-          <w:b/>
-          <w:bCs/>
-          <w:color w:val="1B4332"/>
-          <w:sz w:val="20"/>
-          <w:szCs w:val="20"/>
-        </w:rPr>
-        <w:t xml:space="preserve">Atividade  |  Responsável  |  Prazo</w:t>
-      </w:r>
-    </w:p>
-    <w:p>
-      <w:pPr>
-        <w:spacing w:after="100" w:before="100"/>
-      </w:pPr>
-      <w:r>
-        <w:rPr>
-          <w:rFonts w:ascii="Arial" w:cs="Arial" w:eastAsia="Arial" w:hAnsi="Arial"/>
-          <w:b/>
-          <w:bCs/>
-          <w:color w:val="1B4332"/>
-          <w:sz w:val="20"/>
-          <w:szCs w:val="20"/>
-        </w:rPr>
-        <w:t xml:space="preserve">[ATIVIDADE 1]  |  [NOME]  |  [DATA]</w:t>
-      </w:r>
-    </w:p>
-    <w:p>
-      <w:pPr>
-        <w:spacing w:after="100" w:before="100"/>
-      </w:pPr>
-      <w:r>
-        <w:rPr>
-          <w:rFonts w:ascii="Arial" w:cs="Arial" w:eastAsia="Arial" w:hAnsi="Arial"/>
-          <w:b/>
-          <w:bCs/>
-          <w:color w:val="1B4332"/>
-          <w:sz w:val="20"/>
-          <w:szCs w:val="20"/>
-        </w:rPr>
-        <w:t xml:space="preserve">[ATIVIDADE 2]  |  [NOME]  |  [DATA]</w:t>
-      </w:r>
-    </w:p>
-    <w:p>
-      <w:pPr>
-        <w:spacing w:after="100" w:before="100"/>
-      </w:pPr>
-      <w:r>
-        <w:rPr>
-          <w:rFonts w:ascii="Arial" w:cs="Arial" w:eastAsia="Arial" w:hAnsi="Arial"/>
-          <w:b/>
-          <w:bCs/>
-          <w:color w:val="1B4332"/>
-          <w:sz w:val="20"/>
-          <w:szCs w:val="20"/>
-        </w:rPr>
-        <w:t xml:space="preserve">[ATIVIDADE 3]  |  [NOME]  |  [DATA]</w:t>
-      </w:r>
-    </w:p>
+    <w:tbl>
+      <w:tblPr>
+        <w:tblW w:type="pct" w:w="100%"/>
+        <w:tblBorders>
+          <w:top w:val="single" w:color="auto" w:sz="4"/>
+          <w:left w:val="single" w:color="auto" w:sz="4"/>
+          <w:bottom w:val="single" w:color="auto" w:sz="4"/>
+          <w:right w:val="single" w:color="auto" w:sz="4"/>
+          <w:insideH w:val="single" w:color="auto" w:sz="4"/>
+          <w:insideV w:val="single" w:color="auto" w:sz="4"/>
+        </w:tblBorders>
+      </w:tblPr>
+      <w:tblGrid>
+        <w:gridCol w:w="100"/>
+        <w:gridCol w:w="100"/>
+        <w:gridCol w:w="100"/>
+      </w:tblGrid>
+      <w:tr>
+        <w:tc>
+          <w:tcPr>
+            <w:shd w:fill="1B4332" w:val="clear"/>
+            <w:tcMar>
+              <w:top w:type="dxa" w:w="100"/>
+              <w:left w:type="dxa" w:w="100"/>
+              <w:bottom w:type="dxa" w:w="100"/>
+              <w:right w:type="dxa" w:w="100"/>
+            </w:tcMar>
+            <w:vAlign w:val="center"/>
+          </w:tcPr>
+          <w:p>
+            <w:pPr>
+              <w:jc w:val="center"/>
+            </w:pPr>
+            <w:r>
+              <w:rPr>
+                <w:rFonts w:ascii="Arial" w:cs="Arial" w:eastAsia="Arial" w:hAnsi="Arial"/>
+                <w:b/>
+                <w:bCs/>
+                <w:color w:val="FFFFFF"/>
+                <w:sz w:val="18"/>
+                <w:szCs w:val="18"/>
+              </w:rPr>
+              <w:t xml:space="preserve">Atividade</w:t>
+            </w:r>
+          </w:p>
+        </w:tc>
+        <w:tc>
+          <w:tcPr>
+            <w:shd w:fill="1B4332" w:val="clear"/>
+            <w:tcMar>
+              <w:top w:type="dxa" w:w="100"/>
+              <w:left w:type="dxa" w:w="100"/>
+              <w:bottom w:type="dxa" w:w="100"/>
+              <w:right w:type="dxa" w:w="100"/>
+            </w:tcMar>
+            <w:vAlign w:val="center"/>
+          </w:tcPr>
+          <w:p>
+            <w:pPr>
+              <w:jc w:val="center"/>
+            </w:pPr>
+            <w:r>
+              <w:rPr>
+                <w:rFonts w:ascii="Arial" w:cs="Arial" w:eastAsia="Arial" w:hAnsi="Arial"/>
+                <w:b/>
+                <w:bCs/>
+                <w:color w:val="FFFFFF"/>
+                <w:sz w:val="18"/>
+                <w:szCs w:val="18"/>
+              </w:rPr>
+              <w:t xml:space="preserve">Responsável</w:t>
+            </w:r>
+          </w:p>
+        </w:tc>
+        <w:tc>
+          <w:tcPr>
+            <w:shd w:fill="1B4332" w:val="clear"/>
+            <w:tcMar>
+              <w:top w:type="dxa" w:w="100"/>
+              <w:left w:type="dxa" w:w="100"/>
+              <w:bottom w:type="dxa" w:w="100"/>
+              <w:right w:type="dxa" w:w="100"/>
+            </w:tcMar>
+            <w:vAlign w:val="center"/>
+          </w:tcPr>
+          <w:p>
+            <w:pPr>
+              <w:jc w:val="center"/>
+            </w:pPr>
+            <w:r>
+              <w:rPr>
+                <w:rFonts w:ascii="Arial" w:cs="Arial" w:eastAsia="Arial" w:hAnsi="Arial"/>
+                <w:b/>
+                <w:bCs/>
+                <w:color w:val="FFFFFF"/>
+                <w:sz w:val="18"/>
+                <w:szCs w:val="18"/>
+              </w:rPr>
+              <w:t xml:space="preserve">Prazo</w:t>
+            </w:r>
+          </w:p>
+        </w:tc>
+      </w:tr>
+      <w:tr>
+        <w:tc>
+          <w:tcPr>
+            <w:tcMar>
+              <w:top w:type="dxa" w:w="100"/>
+              <w:left w:type="dxa" w:w="100"/>
+              <w:bottom w:type="dxa" w:w="100"/>
+              <w:right w:type="dxa" w:w="100"/>
+            </w:tcMar>
+            <w:vAlign w:val="center"/>
+          </w:tcPr>
+          <w:p>
+            <w:pPr>
+              <w:jc w:val="center"/>
+            </w:pPr>
+            <w:r>
+              <w:rPr>
+                <w:rFonts w:ascii="Arial" w:cs="Arial" w:eastAsia="Arial" w:hAnsi="Arial"/>
+                <w:b w:val="false"/>
+                <w:bCs w:val="false"/>
+                <w:color w:val="111827"/>
+                <w:sz w:val="18"/>
+                <w:szCs w:val="18"/>
+              </w:rPr>
+              <w:t xml:space="preserve">[ATIVIDADE 1]</w:t>
+            </w:r>
+          </w:p>
+        </w:tc>
+        <w:tc>
+          <w:tcPr>
+            <w:tcMar>
+              <w:top w:type="dxa" w:w="100"/>
+              <w:left w:type="dxa" w:w="100"/>
+              <w:bottom w:type="dxa" w:w="100"/>
+              <w:right w:type="dxa" w:w="100"/>
+            </w:tcMar>
+            <w:vAlign w:val="center"/>
+          </w:tcPr>
+          <w:p>
+            <w:pPr>
+              <w:jc w:val="center"/>
+            </w:pPr>
+            <w:r>
+              <w:rPr>
+                <w:rFonts w:ascii="Arial" w:cs="Arial" w:eastAsia="Arial" w:hAnsi="Arial"/>
+                <w:b w:val="false"/>
+                <w:bCs w:val="false"/>
+                <w:color w:val="111827"/>
+                <w:sz w:val="18"/>
+                <w:szCs w:val="18"/>
+              </w:rPr>
+              <w:t xml:space="preserve">[NOME]</w:t>
+            </w:r>
+          </w:p>
+        </w:tc>
+        <w:tc>
+          <w:tcPr>
+            <w:tcMar>
+              <w:top w:type="dxa" w:w="100"/>
+              <w:left w:type="dxa" w:w="100"/>
+              <w:bottom w:type="dxa" w:w="100"/>
+              <w:right w:type="dxa" w:w="100"/>
+            </w:tcMar>
+            <w:vAlign w:val="center"/>
+          </w:tcPr>
+          <w:p>
+            <w:pPr>
+              <w:jc w:val="center"/>
+            </w:pPr>
+            <w:r>
+              <w:rPr>
+                <w:rFonts w:ascii="Arial" w:cs="Arial" w:eastAsia="Arial" w:hAnsi="Arial"/>
+                <w:b w:val="false"/>
+                <w:bCs w:val="false"/>
+                <w:color w:val="111827"/>
+                <w:sz w:val="18"/>
+                <w:szCs w:val="18"/>
+              </w:rPr>
+              <w:t xml:space="preserve">[DATA]</w:t>
+            </w:r>
+          </w:p>
+        </w:tc>
+      </w:tr>
+      <w:tr>
+        <w:tc>
+          <w:tcPr>
+            <w:tcMar>
+              <w:top w:type="dxa" w:w="100"/>
+              <w:left w:type="dxa" w:w="100"/>
+              <w:bottom w:type="dxa" w:w="100"/>
+              <w:right w:type="dxa" w:w="100"/>
+            </w:tcMar>
+            <w:vAlign w:val="center"/>
+          </w:tcPr>
+          <w:p>
+            <w:pPr>
+              <w:jc w:val="center"/>
+            </w:pPr>
+            <w:r>
+              <w:rPr>
+                <w:rFonts w:ascii="Arial" w:cs="Arial" w:eastAsia="Arial" w:hAnsi="Arial"/>
+                <w:b w:val="false"/>
+                <w:bCs w:val="false"/>
+                <w:color w:val="111827"/>
+                <w:sz w:val="18"/>
+                <w:szCs w:val="18"/>
+              </w:rPr>
+              <w:t xml:space="preserve">[ATIVIDADE 2]</w:t>
+            </w:r>
+          </w:p>
+        </w:tc>
+        <w:tc>
+          <w:tcPr>
+            <w:tcMar>
+              <w:top w:type="dxa" w:w="100"/>
+              <w:left w:type="dxa" w:w="100"/>
+              <w:bottom w:type="dxa" w:w="100"/>
+              <w:right w:type="dxa" w:w="100"/>
+            </w:tcMar>
+            <w:vAlign w:val="center"/>
+          </w:tcPr>
+          <w:p>
+            <w:pPr>
+              <w:jc w:val="center"/>
+            </w:pPr>
+            <w:r>
+              <w:rPr>
+                <w:rFonts w:ascii="Arial" w:cs="Arial" w:eastAsia="Arial" w:hAnsi="Arial"/>
+                <w:b w:val="false"/>
+                <w:bCs w:val="false"/>
+                <w:color w:val="111827"/>
+                <w:sz w:val="18"/>
+                <w:szCs w:val="18"/>
+              </w:rPr>
+              <w:t xml:space="preserve">[NOME]</w:t>
+            </w:r>
+          </w:p>
+        </w:tc>
+        <w:tc>
+          <w:tcPr>
+            <w:tcMar>
+              <w:top w:type="dxa" w:w="100"/>
+              <w:left w:type="dxa" w:w="100"/>
+              <w:bottom w:type="dxa" w:w="100"/>
+              <w:right w:type="dxa" w:w="100"/>
+            </w:tcMar>
+            <w:vAlign w:val="center"/>
+          </w:tcPr>
+          <w:p>
+            <w:pPr>
+              <w:jc w:val="center"/>
+            </w:pPr>
+            <w:r>
+              <w:rPr>
+                <w:rFonts w:ascii="Arial" w:cs="Arial" w:eastAsia="Arial" w:hAnsi="Arial"/>
+                <w:b w:val="false"/>
+                <w:bCs w:val="false"/>
+                <w:color w:val="111827"/>
+                <w:sz w:val="18"/>
+                <w:szCs w:val="18"/>
+              </w:rPr>
+              <w:t xml:space="preserve">[DATA]</w:t>
+            </w:r>
+          </w:p>
+        </w:tc>
+      </w:tr>
+      <w:tr>
+        <w:tc>
+          <w:tcPr>
+            <w:tcMar>
+              <w:top w:type="dxa" w:w="100"/>
+              <w:left w:type="dxa" w:w="100"/>
+              <w:bottom w:type="dxa" w:w="100"/>
+              <w:right w:type="dxa" w:w="100"/>
+            </w:tcMar>
+            <w:vAlign w:val="center"/>
+          </w:tcPr>
+          <w:p>
+            <w:pPr>
+              <w:jc w:val="center"/>
+            </w:pPr>
+            <w:r>
+              <w:rPr>
+                <w:rFonts w:ascii="Arial" w:cs="Arial" w:eastAsia="Arial" w:hAnsi="Arial"/>
+                <w:b w:val="false"/>
+                <w:bCs w:val="false"/>
+                <w:color w:val="111827"/>
+                <w:sz w:val="18"/>
+                <w:szCs w:val="18"/>
+              </w:rPr>
+              <w:t xml:space="preserve">[ATIVIDADE 3]</w:t>
+            </w:r>
+          </w:p>
+        </w:tc>
+        <w:tc>
+          <w:tcPr>
+            <w:tcMar>
+              <w:top w:type="dxa" w:w="100"/>
+              <w:left w:type="dxa" w:w="100"/>
+              <w:bottom w:type="dxa" w:w="100"/>
+              <w:right w:type="dxa" w:w="100"/>
+            </w:tcMar>
+            <w:vAlign w:val="center"/>
+          </w:tcPr>
+          <w:p>
+            <w:pPr>
+              <w:jc w:val="center"/>
+            </w:pPr>
+            <w:r>
+              <w:rPr>
+                <w:rFonts w:ascii="Arial" w:cs="Arial" w:eastAsia="Arial" w:hAnsi="Arial"/>
+                <w:b w:val="false"/>
+                <w:bCs w:val="false"/>
+                <w:color w:val="111827"/>
+                <w:sz w:val="18"/>
+                <w:szCs w:val="18"/>
+              </w:rPr>
+              <w:t xml:space="preserve">[NOME]</w:t>
+            </w:r>
+          </w:p>
+        </w:tc>
+        <w:tc>
+          <w:tcPr>
+            <w:tcMar>
+              <w:top w:type="dxa" w:w="100"/>
+              <w:left w:type="dxa" w:w="100"/>
+              <w:bottom w:type="dxa" w:w="100"/>
+              <w:right w:type="dxa" w:w="100"/>
+            </w:tcMar>
+            <w:vAlign w:val="center"/>
+          </w:tcPr>
+          <w:p>
+            <w:pPr>
+              <w:jc w:val="center"/>
+            </w:pPr>
+            <w:r>
+              <w:rPr>
+                <w:rFonts w:ascii="Arial" w:cs="Arial" w:eastAsia="Arial" w:hAnsi="Arial"/>
+                <w:b w:val="false"/>
+                <w:bCs w:val="false"/>
+                <w:color w:val="111827"/>
+                <w:sz w:val="18"/>
+                <w:szCs w:val="18"/>
+              </w:rPr>
+              <w:t xml:space="preserve">[DATA]</w:t>
+            </w:r>
+          </w:p>
+        </w:tc>
+      </w:tr>
+    </w:tbl>
     <w:p>
       <w:pPr>
         <w:pBdr>

</xml_diff>